<commit_message>
Informe: incluye el resultado de la prueba en vivo con Claude Code
Co-Authored-By: Claude Sonnet 5.5 <noreply@anthropic.com>
</commit_message>
<xml_diff>
--- a/Modulo 7_1/informe/Informe_Tarea_7_1.docx
+++ b/Modulo 7_1/informe/Informe_Tarea_7_1.docx
@@ -408,7 +408,7 @@
           <w:b w:val="0"/>
           <w:i w:val="0"/>
         </w:rPr>
-        <w:t xml:space="preserve"> define qué se ejecuta y qué puede usar Claude, y </w:t>
+        <w:t xml:space="preserve"> define qué se ejecuta y el agente recibe su rol y sus herramientas de lectura. Con </w:t>
       </w:r>
       <w:r>
         <w:rPr>
@@ -417,14 +417,14 @@
           <w:i w:val="0"/>
           <w:sz w:val="20"/>
         </w:rPr>
-        <w:t>auditor-de-equidad.md</w:t>
+        <w:t>claude --plugin-dir extension</w:t>
       </w:r>
       <w:r>
         <w:rPr>
           <w:b w:val="0"/>
           <w:i w:val="0"/>
         </w:rPr>
-        <w:t xml:space="preserve"> le da al agente su rol y sus herramientas (Read, Grep, Glob).</w:t>
+        <w:t xml:space="preserve"> el comando devolvió la ficha y el agente concluyó que «es justo con todos» no está sustentado.</w:t>
       </w:r>
     </w:p>
     <w:p>
@@ -775,7 +775,7 @@
           <w:b w:val="0"/>
           <w:i w:val="0"/>
         </w:rPr>
-        <w:t>Las tres piezas reducen errores repetibles y ninguna sustituye el criterio: la auditoría muestra dónde mirar, el hook solo vigila lo que alguien ya escribió como regla, y la extensión empaqueta instrucciones cuya calidad no comprueba.</w:t>
+        <w:t>Las tres piezas reducen errores repetibles, pero ninguna sustituye el criterio: el hook solo vigila reglas ya escritas y la extensión no comprueba la calidad de sus instrucciones.</w:t>
       </w:r>
     </w:p>
     <w:p>

</xml_diff>